<commit_message>
feat: RequirementsPack with the three queues (0.2.0)
- A 交付 / B 待确认 / C 必须处理, printed as three sections with C first.
- Queue C is a gate: while non-empty the pack reports deliverable=false and the
  report says the check is 未完成体检. A merged list is what lets a tool say 'no
  findings' when it only found nothing it could quote.
- Coverage net over ten topics, each hit or explicitly 'not found'.
- Rejection clauses sorted into six families rather than one keyword table.
- Fixes the composition reader: numbering must run consecutively, so a heading
  like '3.7 投标文件的递交' no longer becomes entry 7 of the previous list.
- Clause titles anchor on the clause word, not the first comma.
</commit_message>
<xml_diff>
--- a/tests/fixtures/tender-sample.docx
+++ b/tests/fixtures/tender-sample.docx
@@ -10,6 +10,41 @@
     <w:p>
       <w:r>
         <w:t xml:space="preserve">投标文件应由以下部分组成：</w:t>
+      </w:r>
+    </w:p>
+    <w:p>
+      <w:r>
+        <w:t xml:space="preserve">1. 投标函及投标函附录</w:t>
+      </w:r>
+    </w:p>
+    <w:p>
+      <w:r>
+        <w:t xml:space="preserve">2. 法定代表人身份证明或授权委托书</w:t>
+      </w:r>
+    </w:p>
+    <w:p>
+      <w:r>
+        <w:t xml:space="preserve">3. 投标保证金缴纳凭证</w:t>
+      </w:r>
+    </w:p>
+    <w:p>
+      <w:r>
+        <w:t xml:space="preserve">4. 已标价工程量清单</w:t>
+      </w:r>
+    </w:p>
+    <w:p>
+      <w:r>
+        <w:t xml:space="preserve">5. 施工组织设计</w:t>
+      </w:r>
+    </w:p>
+    <w:p>
+      <w:r>
+        <w:t xml:space="preserve">6. 资格审查资料</w:t>
+      </w:r>
+    </w:p>
+    <w:p>
+      <w:r>
+        <w:t xml:space="preserve"/>
       </w:r>
     </w:p>
     <w:tbl>
@@ -199,37 +234,32 @@
     </w:tbl>
     <w:p>
       <w:r>
-        <w:t xml:space="preserve">1. 投标函及投标函附录</w:t>
-      </w:r>
-    </w:p>
-    <w:p>
-      <w:r>
-        <w:t xml:space="preserve">2. 法定代表人身份证明或授权委托书</w:t>
-      </w:r>
-    </w:p>
-    <w:p>
-      <w:r>
-        <w:t xml:space="preserve">3. 投标保证金缴纳凭证</w:t>
-      </w:r>
-    </w:p>
-    <w:p>
-      <w:r>
-        <w:t xml:space="preserve">4. 已标价工程量清单</w:t>
-      </w:r>
-    </w:p>
-    <w:p>
-      <w:r>
-        <w:t xml:space="preserve">5. 施工组织设计</w:t>
-      </w:r>
-    </w:p>
-    <w:p>
-      <w:r>
-        <w:t xml:space="preserve">6. 资格审查资料</w:t>
-      </w:r>
-    </w:p>
-    <w:p>
-      <w:r>
-        <w:t xml:space="preserve"/>
+        <w:t xml:space="preserve">3.7 投标文件的递交</w:t>
+      </w:r>
+    </w:p>
+    <w:p>
+      <w:r>
+        <w:t xml:space="preserve">逾期送达或者未按照招标文件要求密封的投标文件，采购人、采购代理机构应当拒收。</w:t>
+      </w:r>
+    </w:p>
+    <w:p>
+      <w:r>
+        <w:t xml:space="preserve">未加盖投标人公章的投标文件按无效投标处理。</w:t>
+      </w:r>
+    </w:p>
+    <w:p>
+      <w:r>
+        <w:t xml:space="preserve">投标报价超过最高限价的，其投标无效。</w:t>
+      </w:r>
+    </w:p>
+    <w:p>
+      <w:r>
+        <w:t xml:space="preserve">经评标委员会认定属于重大偏差的，应当否决其投标。</w:t>
+      </w:r>
+    </w:p>
+    <w:p>
+      <w:r>
+        <w:t xml:space="preserve">原则上，投标有效期不足的按无效投标处理。</w:t>
       </w:r>
     </w:p>
     <w:p>

</xml_diff>